<commit_message>
Gunasai H00 ID added
</commit_message>
<xml_diff>
--- a/AI Reflective Statement.docx
+++ b/AI Reflective Statement.docx
@@ -84,13 +84,6 @@
         </w:rPr>
         <w:t xml:space="preserve"> </w:t>
       </w:r>
-      <w:r>
-        <w:rPr>
-          <w:sz w:val="28"/>
-          <w:szCs w:val="28"/>
-        </w:rPr>
-        <w:t xml:space="preserve"> </w:t>
-      </w:r>
       <w:proofErr w:type="spellStart"/>
       <w:r>
         <w:rPr>
@@ -100,6 +93,13 @@
         <w:t>Anumulapally</w:t>
       </w:r>
       <w:proofErr w:type="spellEnd"/>
+      <w:r>
+        <w:rPr>
+          <w:sz w:val="28"/>
+          <w:szCs w:val="28"/>
+        </w:rPr>
+        <w:t xml:space="preserve"> H00557945</w:t>
+      </w:r>
     </w:p>
     <w:p>
       <w:pPr>
@@ -329,7 +329,6 @@
         </w:rPr>
         <w:t xml:space="preserve"> </w:t>
       </w:r>
-      <w:proofErr w:type="gramStart"/>
       <w:r>
         <w:rPr>
           <w:sz w:val="28"/>
@@ -349,15 +348,7 @@
           <w:sz w:val="28"/>
           <w:szCs w:val="28"/>
         </w:rPr>
-        <w:t>based</w:t>
-      </w:r>
-      <w:proofErr w:type="gramEnd"/>
-      <w:r>
-        <w:rPr>
-          <w:sz w:val="28"/>
-          <w:szCs w:val="28"/>
-        </w:rPr>
-        <w:t xml:space="preserve"> controllers in </w:t>
+        <w:t xml:space="preserve">based controllers in </w:t>
       </w:r>
       <w:proofErr w:type="spellStart"/>
       <w:r>
@@ -2033,6 +2024,7 @@
   <w:style w:type="character" w:default="1" w:styleId="DefaultParagraphFont">
     <w:name w:val="Default Paragraph Font"/>
     <w:uiPriority w:val="1"/>
+    <w:semiHidden/>
     <w:unhideWhenUsed/>
   </w:style>
   <w:style w:type="table" w:default="1" w:styleId="TableNormal">

</xml_diff>